<commit_message>
thesis: add workflow diagrams to final docx
</commit_message>
<xml_diff>
--- a/thesis/陈天元 256360231.docx
+++ b/thesis/陈天元 256360231.docx
@@ -744,13 +744,8 @@
         <w:pStyle w:val="a0"/>
       </w:pPr>
       <w:r>
-        <w:t>牙科智能问答若要服务于患者教育与分诊辅助，其核心问题不在于模型规模本身，而在于高性能能力能否以可承受的成本完成部署。针对这一问题，本文以牙科医学选择题自动答题为研究对象，采用知识蒸馏（</w:t>
-      </w:r>
-      <w:r>
-        <w:t>Knowledge Distillation, KD</w:t>
-      </w:r>
-      <w:r>
-        <w:t>）方法，将大型教师模型的判别能力迁移到较小的学生模型，以同时兼顾准确率、部署成本与可复现性。</w:t>
+        <w:rPr/>
+        <w:t>牙科智能问答若要服务于患者教育与分诊辅助，其核心问题不在于模型规模本身，而在于高性能能力能否以可承受的成本完成部署。针对这一问题，本文以牙科医学选择题自动答题为研究对象，采用知识蒸馏（Knowledge Distillation, KD）方法，将大型教师模型的判别能力迁移到较小的学生模型，以同时兼顾准确率、部署成本与可复现性，并通过系统性对比实验分析教师类型、学生容量与标签形态对蒸馏效果的影响。</w:t>
       </w:r>
     </w:p>
     <w:p>
@@ -1075,9 +1070,9 @@
       </w:pPr>
       <w:r>
         <w:rPr>
-          <w:rFonts w:ascii="Times New Roman" w:hAnsi="Times New Roman" w:cs="Times New Roman"/>
-        </w:rPr>
-        <w:t>Based on the Chinese Medical Examination dataset CMExam, this study establishes a reproducible evaluation setup for dental five-option multiple-choice questions and, on this basis, proposes a Choice-Head two-stage distillation framework. Instead of distilling full-vocabulary logits, the framework directly learns the probability distribution over options A/B/C/D/E, which both preserves task-relevant supervisory signals and remains compatible with black-box API teachers while substantially reducing memory overhead. Across 21 systematic experiments, four main findings are obtained. First, a Qwen2.5-14B student reaches 89.10% best accuracy on the 991-question full test set, with an 88.67% three-seed mean, exceeding the DeepSeek-V3 teacher’s 87.18% under 45× parameter compression. Second, teacher quality shows an inverted-U relationship with distillation gain, with the best signal appearing when the teacher-GT disagreement rate falls between 5% and 15%. Third, analyses based on Fisher-Rao distance and the α-divergence family show that real logprobs retain much richer continuous structure than manually smoothed labels, with approximately 2,500 times higher volume density. Fourth, useful distillation remains possible across architectures: a Llama-3.3-70B teacher with 72.45% accuracy can still produce a 14B student reaching 87.25%.</w:t>
+          <w:rFonts w:ascii="Times New Roman" w:hAnsi="Times New Roman"/>
+        </w:rPr>
+        <w:t>Based on the Chinese Medical Examination dataset CMExam, this study establishes a reproducible evaluation setup for dental five-option multiple-choice questions and, on this basis, proposes a Choice-Head two-stage distillation framework. Instead of distilling full-vocabulary logits, the framework directly learns the probability distribution over options A/B/C/D/E, which both preserves task-relevant supervisory signals and remains compatible with black-box API teachers while substantially reducing memory overhead. Across 21 systematic experiments, four main findings are obtained. First, a Qwen2.5-14B student reaches 89.10% best accuracy on the 991-question full test set, with an 88.67% three-seed mean, exceeding the DeepSeek-V3 teacher’s 87.18% under 45× parameter compression. Second, teacher quality shows an inverted-U relationship with distillation gain, with the best signal appearing when the teacher-GT disagreement rate falls between 5% and 15%. Third, analyses based on Fisher-Rao distance and the α-divergence family show that real logprobs retain much richer continuous structure than manually smoothed labels, with approximately 2,500 times higher volume density. Fourth, useful distillation remains possible even in the cross-architecture setting, where the teacher and student belong to different model families: a Llama-3.3-70B teacher with 72.45% accuracy can still distill a 14B Qwen student that reaches 87.25%.</w:t>
       </w:r>
     </w:p>
     <w:p>
@@ -12057,224 +12052,74 @@
       </w:pPr>
       <w:r>
         <w:rPr>
-          <w:rFonts w:ascii="Times New Roman" w:hAnsi="Times New Roman" w:cs="Times New Roman"/>
-        </w:rPr>
-        <w:t>但当蒸馏对象从图像分类网络转向大语言模型时，经典方案会立刻遇到任务与系统层面的双重约束。第一，词表规模膨胀使全</w:t>
-      </w:r>
-      <w:r>
-        <w:rPr>
-          <w:rFonts w:ascii="Times New Roman" w:hAnsi="Times New Roman" w:cs="Times New Roman"/>
-        </w:rPr>
-        <w:t xml:space="preserve"> vocab logits </w:t>
-      </w:r>
-      <w:r>
-        <w:rPr>
-          <w:rFonts w:ascii="Times New Roman" w:hAnsi="Times New Roman" w:cs="Times New Roman"/>
-        </w:rPr>
-        <w:t>的存储与计算代价迅速上升，例如</w:t>
-      </w:r>
-      <w:r>
-        <w:rPr>
-          <w:rFonts w:ascii="Times New Roman" w:hAnsi="Times New Roman" w:cs="Times New Roman"/>
-        </w:rPr>
-        <w:t xml:space="preserve"> Qwen2.5 </w:t>
-      </w:r>
-      <w:r>
-        <w:rPr>
-          <w:rFonts w:ascii="Times New Roman" w:hAnsi="Times New Roman" w:cs="Times New Roman"/>
-        </w:rPr>
-        <w:t>的输出空间已达到</w:t>
-      </w:r>
-      <w:r>
-        <w:rPr>
-          <w:rFonts w:ascii="Times New Roman" w:hAnsi="Times New Roman" w:cs="Times New Roman"/>
-        </w:rPr>
-        <w:t xml:space="preserve"> 151,936 </w:t>
-      </w:r>
-      <w:r>
-        <w:rPr>
-          <w:rFonts w:ascii="Times New Roman" w:hAnsi="Times New Roman" w:cs="Times New Roman"/>
-        </w:rPr>
-        <w:t>维</w:t>
-      </w:r>
-      <w:r>
-        <w:rPr>
-          <w:rFonts w:ascii="Times New Roman" w:hAnsi="Times New Roman" w:cs="Times New Roman"/>
-        </w:rPr>
-        <w:t>[4]</w:t>
-      </w:r>
-      <w:r>
-        <w:rPr>
-          <w:rFonts w:ascii="Times New Roman" w:hAnsi="Times New Roman" w:cs="Times New Roman"/>
-        </w:rPr>
-        <w:t>。第二，许多高性能教师以</w:t>
-      </w:r>
-      <w:r>
-        <w:rPr>
-          <w:rFonts w:ascii="Times New Roman" w:hAnsi="Times New Roman" w:cs="Times New Roman"/>
-        </w:rPr>
-        <w:t xml:space="preserve"> API </w:t>
-      </w:r>
-      <w:r>
-        <w:rPr>
-          <w:rFonts w:ascii="Times New Roman" w:hAnsi="Times New Roman" w:cs="Times New Roman"/>
-        </w:rPr>
-        <w:t>形式存在，外部研究者无法稳定获得完整内部状态，</w:t>
+          <w:rFonts w:ascii="Times New Roman" w:hAnsi="Times New Roman"/>
+        </w:rPr>
+        <w:t>但当蒸馏对象从图像分类网络转向大语言模型时，经典方案会立刻遇到任务与系统层面的双重约束。第一，词表规模膨胀使全 vocab logits 的存储与计算代价迅速上升，例如 Qwen2.5 的输出空间已达到 151,936 维[4]。第二，许多高性能教师仅以远程云端 API 服务形式提供，外部研究者通常只能访问输入输出接口，而无法稳定获得 logits、隐藏状态等完整内部信息，传统白盒蒸馏因此失去适用前提。第三，大语言模型通常服务于具体任务场景，不同任务对蒸馏信号的需求差异很大，通用式蒸馏目标未必最有效[5,19,20]。</w:t>
+      </w:r>
+    </w:p>
+    <w:p>
+      <w:pPr>
+        <w:pStyle w:val="a0"/>
+        <w:rPr>
+          <w:rFonts w:ascii="Times New Roman" w:hAnsi="Times New Roman" w:cs="Times New Roman"/>
+        </w:rPr>
+      </w:pPr>
+      <w:r>
+        <w:rPr>
+          <w:rFonts w:ascii="Times New Roman" w:hAnsi="Times New Roman"/>
+        </w:rPr>
+        <w:t>在这种背景下，任务结构本身就成为重新定义蒸馏目标的依据。对于五选一医学选择题，教师真正需要传递给学生的信息不在于完整词表上的概率细节，而在于 A/B/C/D/E 五个候选项之间的相对支持关系。沿着任务蒸馏与面向下游决策空间压缩监督目标的思路[19,20]，本文将原本针对通用 token 分布的蒸馏过程改写为面向五维选择头的决策分布迁移，并将这一任务化输出头定义为 Choice-Head。这样处理后，无论教师来自本地模型还是远程 API 服务，只要能够提供选项级分布或可恢复的选项信息，就有可能形成有效监督。</w:t>
+      </w:r>
+    </w:p>
+    <w:p>
+      <w:pPr>
+        <w:pStyle w:val="a0"/>
+        <w:rPr>
+          <w:rFonts w:ascii="Times New Roman" w:hAnsi="Times New Roman" w:cs="Times New Roman"/>
+        </w:rPr>
+      </w:pPr>
+      <w:r>
+        <w:rPr>
+          <w:rFonts w:ascii="Times New Roman" w:hAnsi="Times New Roman" w:cs="Times New Roman"/>
+        </w:rPr>
+        <w:t>与此同时，参数高效微调也为蒸馏提供了现实可行的训练载体。</w:t>
+      </w:r>
+      <w:r>
+        <w:rPr>
+          <w:rFonts w:ascii="Times New Roman" w:hAnsi="Times New Roman" w:cs="Times New Roman"/>
+        </w:rPr>
+        <w:t>LoRA</w:t>
+      </w:r>
+      <w:r>
+        <w:rPr>
+          <w:rFonts w:ascii="Times New Roman" w:hAnsi="Times New Roman" w:cs="Times New Roman"/>
+        </w:rPr>
+        <w:t>（</w:t>
+      </w:r>
+      <w:r>
+        <w:rPr>
+          <w:rFonts w:ascii="Times New Roman" w:hAnsi="Times New Roman" w:cs="Times New Roman"/>
+        </w:rPr>
+        <w:t>Low-Rank Adaptation</w:t>
+      </w:r>
+      <w:r>
+        <w:rPr>
+          <w:rFonts w:ascii="Times New Roman" w:hAnsi="Times New Roman" w:cs="Times New Roman"/>
+        </w:rPr>
+        <w:t>）通过低</w:t>
       </w:r>
       <w:proofErr w:type="gramStart"/>
       <w:r>
         <w:rPr>
           <w:rFonts w:ascii="Times New Roman" w:hAnsi="Times New Roman" w:cs="Times New Roman"/>
         </w:rPr>
-        <w:t>传统白盒蒸馏</w:t>
+        <w:t>秩</w:t>
       </w:r>
       <w:proofErr w:type="gramEnd"/>
       <w:r>
         <w:rPr>
           <w:rFonts w:ascii="Times New Roman" w:hAnsi="Times New Roman" w:cs="Times New Roman"/>
         </w:rPr>
-        <w:t>因此失去适用前提。第三，大语言模型通常服务于具体任务场景，不同任务对蒸馏信号的需求差异很大，通用式蒸馏目标未必最有效</w:t>
-      </w:r>
-      <w:r>
-        <w:rPr>
-          <w:rFonts w:ascii="Times New Roman" w:hAnsi="Times New Roman" w:cs="Times New Roman"/>
-        </w:rPr>
-        <w:t>[5,19,20]</w:t>
-      </w:r>
-      <w:r>
-        <w:rPr>
-          <w:rFonts w:ascii="Times New Roman" w:hAnsi="Times New Roman" w:cs="Times New Roman"/>
-        </w:rPr>
-        <w:t>。</w:t>
-      </w:r>
-    </w:p>
-    <w:p>
-      <w:pPr>
-        <w:pStyle w:val="a0"/>
-        <w:rPr>
-          <w:rFonts w:ascii="Times New Roman" w:hAnsi="Times New Roman" w:cs="Times New Roman"/>
-        </w:rPr>
-      </w:pPr>
-      <w:r>
-        <w:rPr>
-          <w:rFonts w:ascii="Times New Roman" w:hAnsi="Times New Roman" w:cs="Times New Roman"/>
-        </w:rPr>
-        <w:t>在这种背景下，任务结构本身就成为重新定义蒸馏目标的依据。对于五选</w:t>
-      </w:r>
-      <w:proofErr w:type="gramStart"/>
-      <w:r>
-        <w:rPr>
-          <w:rFonts w:ascii="Times New Roman" w:hAnsi="Times New Roman" w:cs="Times New Roman"/>
-        </w:rPr>
-        <w:t>一</w:t>
-      </w:r>
-      <w:proofErr w:type="gramEnd"/>
-      <w:r>
-        <w:rPr>
-          <w:rFonts w:ascii="Times New Roman" w:hAnsi="Times New Roman" w:cs="Times New Roman"/>
-        </w:rPr>
-        <w:t>医学选择题，教师需要传递给学生的信息并不在于完整词表上的概率细节，而在于五个候选项之间的相对支持关系。只要能够恢复这种</w:t>
-      </w:r>
-      <w:proofErr w:type="gramStart"/>
-      <w:r>
-        <w:rPr>
-          <w:rFonts w:ascii="Times New Roman" w:hAnsi="Times New Roman" w:cs="Times New Roman"/>
-        </w:rPr>
-        <w:t>选项级</w:t>
-      </w:r>
-      <w:proofErr w:type="gramEnd"/>
-      <w:r>
-        <w:rPr>
-          <w:rFonts w:ascii="Times New Roman" w:hAnsi="Times New Roman" w:cs="Times New Roman"/>
-        </w:rPr>
-        <w:t>分布，无论教师来自本地模型还是</w:t>
-      </w:r>
-      <w:r>
-        <w:rPr>
-          <w:rFonts w:ascii="Times New Roman" w:hAnsi="Times New Roman" w:cs="Times New Roman"/>
-        </w:rPr>
-        <w:t xml:space="preserve"> API </w:t>
-      </w:r>
-      <w:r>
-        <w:rPr>
-          <w:rFonts w:ascii="Times New Roman" w:hAnsi="Times New Roman" w:cs="Times New Roman"/>
-        </w:rPr>
-        <w:t>服务，都有可能形成有效监督。基于这一思</w:t>
-      </w:r>
-      <w:r>
-        <w:rPr>
-          <w:rFonts w:ascii="Times New Roman" w:hAnsi="Times New Roman" w:cs="Times New Roman"/>
-        </w:rPr>
-        <w:t xml:space="preserve">路，本文将蒸馏问题从通用 </w:t>
-      </w:r>
-      <w:r>
-        <w:rPr>
-          <w:rFonts w:ascii="Times New Roman" w:hAnsi="Times New Roman" w:cs="Times New Roman"/>
-        </w:rPr>
-        <w:t>token 分布匹配改写为任务头层面的</w:t>
-      </w:r>
-      <w:r>
-        <w:rPr>
-          <w:rFonts w:ascii="Times New Roman" w:hAnsi="Times New Roman" w:cs="Times New Roman"/>
-        </w:rPr>
-        <w:t>决策分布迁移，</w:t>
-      </w:r>
-      <w:r>
-        <w:rPr>
-          <w:rFonts w:ascii="Times New Roman" w:hAnsi="Times New Roman" w:cs="Times New Roman"/>
-        </w:rPr>
-        <w:t>并提出了 Choice-Head 蒸馏方法。</w:t>
-      </w:r>
-    </w:p>
-    <w:p>
-      <w:pPr>
-        <w:pStyle w:val="a0"/>
-        <w:rPr>
-          <w:rFonts w:ascii="Times New Roman" w:hAnsi="Times New Roman" w:cs="Times New Roman"/>
-        </w:rPr>
-      </w:pPr>
-      <w:r>
-        <w:rPr>
-          <w:rFonts w:ascii="Times New Roman" w:hAnsi="Times New Roman" w:cs="Times New Roman"/>
-        </w:rPr>
-        <w:t>与此同时，参数高效微调也为蒸馏提供了现实可行的训练载体。</w:t>
-      </w:r>
-      <w:r>
-        <w:rPr>
-          <w:rFonts w:ascii="Times New Roman" w:hAnsi="Times New Roman" w:cs="Times New Roman"/>
-        </w:rPr>
-        <w:t>LoRA</w:t>
-      </w:r>
-      <w:r>
-        <w:rPr>
-          <w:rFonts w:ascii="Times New Roman" w:hAnsi="Times New Roman" w:cs="Times New Roman"/>
-        </w:rPr>
-        <w:t>（</w:t>
-      </w:r>
-      <w:r>
-        <w:rPr>
-          <w:rFonts w:ascii="Times New Roman" w:hAnsi="Times New Roman" w:cs="Times New Roman"/>
-        </w:rPr>
-        <w:t>Low-Rank Adaptation</w:t>
-      </w:r>
-      <w:r>
-        <w:rPr>
-          <w:rFonts w:ascii="Times New Roman" w:hAnsi="Times New Roman" w:cs="Times New Roman"/>
-        </w:rPr>
-        <w:t>）通过低</w:t>
-      </w:r>
-      <w:proofErr w:type="gramStart"/>
-      <w:r>
-        <w:rPr>
-          <w:rFonts w:ascii="Times New Roman" w:hAnsi="Times New Roman" w:cs="Times New Roman"/>
-        </w:rPr>
-        <w:t>秩</w:t>
-      </w:r>
-      <w:proofErr w:type="gramEnd"/>
-      <w:r>
-        <w:rPr>
-          <w:rFonts w:ascii="Times New Roman" w:hAnsi="Times New Roman" w:cs="Times New Roman"/>
-        </w:rPr>
         <w:t>增量参数完成大模型适配，使训练成本维持在可控范围内</w:t>
       </w:r>
       <w:r>
@@ -12311,113 +12156,9 @@
       </w:pPr>
       <w:r>
         <w:rPr>
-          <w:rFonts w:ascii="Times New Roman" w:hAnsi="Times New Roman" w:cs="Times New Roman"/>
-        </w:rPr>
-        <w:t>当前蒸馏研究还面临一个经常被忽视的问题，即</w:t>
-      </w:r>
-      <w:r>
-        <w:rPr>
-          <w:rFonts w:ascii="Times New Roman" w:hAnsi="Times New Roman" w:cs="Times New Roman"/>
-        </w:rPr>
-        <w:t>教</w:t>
-      </w:r>
-      <w:r>
-        <w:rPr>
-          <w:rFonts w:ascii="Times New Roman" w:hAnsi="Times New Roman" w:cs="Times New Roman"/>
-        </w:rPr>
-        <w:t>师信息应以何种形式被学生继承，才能最大</w:t>
-      </w:r>
-      <w:r>
-        <w:rPr>
-          <w:rFonts w:ascii="Times New Roman" w:hAnsi="Times New Roman" w:cs="Times New Roman"/>
-        </w:rPr>
-        <w:t>程</w:t>
-      </w:r>
-      <w:r>
-        <w:rPr>
-          <w:rFonts w:ascii="Times New Roman" w:hAnsi="Times New Roman" w:cs="Times New Roman"/>
-        </w:rPr>
-        <w:t>度保留对任务决策有用的结</w:t>
-      </w:r>
-      <w:proofErr w:type="gramStart"/>
-      <w:r>
-        <w:rPr>
-          <w:rFonts w:ascii="Times New Roman" w:hAnsi="Times New Roman" w:cs="Times New Roman"/>
-        </w:rPr>
-        <w:t>构信息</w:t>
-      </w:r>
-      <w:proofErr w:type="gramEnd"/>
-      <w:r>
-        <w:rPr>
-          <w:rFonts w:ascii="Times New Roman" w:hAnsi="Times New Roman" w:cs="Times New Roman"/>
-        </w:rPr>
-        <w:t>。在传统分类任</w:t>
-      </w:r>
-      <w:proofErr w:type="gramStart"/>
-      <w:r>
-        <w:rPr>
-          <w:rFonts w:ascii="Times New Roman" w:hAnsi="Times New Roman" w:cs="Times New Roman"/>
-        </w:rPr>
-        <w:t>务中，类</w:t>
-      </w:r>
-      <w:proofErr w:type="gramEnd"/>
-      <w:r>
-        <w:rPr>
-          <w:rFonts w:ascii="Times New Roman" w:hAnsi="Times New Roman" w:cs="Times New Roman"/>
-        </w:rPr>
-        <w:t>别数固定且较少，软标签天然能够表达类别相似性；</w:t>
-      </w:r>
-      <w:proofErr w:type="gramStart"/>
-      <w:r>
-        <w:rPr>
-          <w:rFonts w:ascii="Times New Roman" w:hAnsi="Times New Roman" w:cs="Times New Roman"/>
-        </w:rPr>
-        <w:t>但在大</w:t>
-      </w:r>
-      <w:proofErr w:type="gramEnd"/>
-      <w:r>
-        <w:rPr>
-          <w:rFonts w:ascii="Times New Roman" w:hAnsi="Times New Roman" w:cs="Times New Roman"/>
-        </w:rPr>
-        <w:t>语言模型任务中，完整词表分布既极高</w:t>
-      </w:r>
-      <w:r>
-        <w:rPr>
-          <w:rFonts w:ascii="Times New Roman" w:hAnsi="Times New Roman" w:cs="Times New Roman"/>
-        </w:rPr>
-        <w:t>维，又包含大</w:t>
-      </w:r>
-      <w:r>
-        <w:rPr>
-          <w:rFonts w:ascii="Times New Roman" w:hAnsi="Times New Roman" w:cs="Times New Roman"/>
-        </w:rPr>
-        <w:t>量与当前任务无关的 token。若不先识别出真正承载决策信息的结构，蒸馏</w:t>
-      </w:r>
-      <w:r>
-        <w:rPr>
-          <w:rFonts w:ascii="Times New Roman" w:hAnsi="Times New Roman" w:cs="Times New Roman"/>
-        </w:rPr>
-        <w:t>就容易退化为高成本的噪声</w:t>
-      </w:r>
-      <w:r>
-        <w:rPr>
-          <w:rFonts w:ascii="Times New Roman" w:hAnsi="Times New Roman" w:cs="Times New Roman"/>
-        </w:rPr>
-        <w:t>传递。Choice-Hea</w:t>
-      </w:r>
-      <w:proofErr w:type="gramStart"/>
-      <w:r>
-        <w:rPr>
-          <w:rFonts w:ascii="Times New Roman" w:hAnsi="Times New Roman" w:cs="Times New Roman"/>
-        </w:rPr>
-        <w:t>d</w:t>
-      </w:r>
-      <w:proofErr w:type="gramEnd"/>
-      <w:r>
-        <w:rPr>
-          <w:rFonts w:ascii="Times New Roman" w:hAnsi="Times New Roman" w:cs="Times New Roman"/>
-        </w:rPr>
-        <w:t xml:space="preserve"> 的出发点正在于此：对于五选一医学选择题，真正需要迁移的不是整个语言生成空间，而是教师如何在有限候选项之间分配支持度。这一判断既是本文方法设计的起点，也是后续实验解释的主线。</w:t>
+          <w:rFonts w:ascii="Times New Roman" w:hAnsi="Times New Roman"/>
+        </w:rPr>
+        <w:t>当前蒸馏研究仍面临一个关键但常被弱化的问题：教师信息究竟应以何种形式被学生继承，才能最大程度保留对最终任务有用的决策结构[5,19,20]。在传统分类任务中，类别数固定且较少，软标签能够直接表达类别相似性，因此 logit-level distillation 往往是自然选择[5,20]。但在大语言模型任务中，完整词表分布既极高维，又包含大量与当前题目无关的 token，直接匹配全词表输出会同时带来计算负担和任务噪声[4,5,19]。现有方法大体可以分为全词表分布匹配、隐层或特征对齐以及面向下游任务输出的蒸馏三类，它们分别适合白盒教师、可访问中间层的训练框架以及结构明确的任务场景[5,19,20]。Choice-Head 的出发点正是在这一比较基础上形成的：对于五选一医学选择题，真正需要迁移的不是整个语言生成空间，而是教师如何在有限候选项之间分配支持度；因此本文选择把监督对象收缩到五维选项头，而不是继续沿用通用 token 级蒸馏[5,19,20]。</w:t>
       </w:r>
     </w:p>
     <w:p>
@@ -15579,6 +15320,53 @@
     </w:p>
     <w:p>
       <w:pPr>
+        <w:jc w:val="center"/>
+      </w:pPr>
+      <w:r>
+        <w:drawing>
+          <wp:inline xmlns:a="http://schemas.openxmlformats.org/drawingml/2006/main" xmlns:pic="http://schemas.openxmlformats.org/drawingml/2006/picture">
+            <wp:extent cx="5616000" cy="3209143"/>
+            <wp:docPr id="2046731438" name="Picture 2046731438"/>
+            <wp:cNvGraphicFramePr>
+              <a:graphicFrameLocks noChangeAspect="1"/>
+            </wp:cNvGraphicFramePr>
+            <a:graphic>
+              <a:graphicData uri="http://schemas.openxmlformats.org/drawingml/2006/picture">
+                <pic:pic>
+                  <pic:nvPicPr>
+                    <pic:cNvPr id="0" name="fig_2_1_tech_route_overview.png"/>
+                    <pic:cNvPicPr/>
+                  </pic:nvPicPr>
+                  <pic:blipFill>
+                    <a:blip r:embed="rId21"/>
+                    <a:stretch>
+                      <a:fillRect/>
+                    </a:stretch>
+                  </pic:blipFill>
+                  <pic:spPr>
+                    <a:xfrm>
+                      <a:off x="0" y="0"/>
+                      <a:ext cx="5616000" cy="3209143"/>
+                    </a:xfrm>
+                    <a:prstGeom prst="rect"/>
+                  </pic:spPr>
+                </pic:pic>
+              </a:graphicData>
+            </a:graphic>
+          </wp:inline>
+        </w:drawing>
+      </w:r>
+    </w:p>
+    <w:p>
+      <w:pPr>
+        <w:jc w:val="center"/>
+      </w:pPr>
+      <w:r>
+        <w:t>图 2-1 技术路线总览图。</w:t>
+      </w:r>
+    </w:p>
+    <w:p>
+      <w:pPr>
         <w:pStyle w:val="1"/>
       </w:pPr>
       <w:bookmarkStart w:id="34" w:name="_Toc230185726"/>
@@ -16321,6 +16109,46 @@
     <w:p>
       <w:pPr>
         <w:pStyle w:val="a0"/>
+      </w:pPr>
+      <w:r>
+        <w:t>为便于理解数据格式，下面给出一条牙科子集样例：</w:t>
+      </w:r>
+    </w:p>
+    <w:p>
+      <w:pPr>
+        <w:pStyle w:val="a0"/>
+      </w:pPr>
+      <w:r>
+        <w:t>题干：上皮基层下疱常见于</w:t>
+      </w:r>
+    </w:p>
+    <w:p>
+      <w:pPr>
+        <w:pStyle w:val="a0"/>
+      </w:pPr>
+      <w:r>
+        <w:t>选项：A 红斑；B 红斑狼疮；C 天疱疮；D 类天疱疮；E 白斑</w:t>
+      </w:r>
+    </w:p>
+    <w:p>
+      <w:pPr>
+        <w:pStyle w:val="a0"/>
+      </w:pPr>
+      <w:r>
+        <w:t>标准答案：D</w:t>
+      </w:r>
+    </w:p>
+    <w:p>
+      <w:pPr>
+        <w:pStyle w:val="a0"/>
+      </w:pPr>
+      <w:r>
+        <w:t>说明：该样例展示了本文使用的五选一 JSONL 数据结构，其核心字段包括题干、五个候选项与标准答案，能够直接映射到后续 Choice-Head 蒸馏所需的选项级监督形式。</w:t>
+      </w:r>
+    </w:p>
+    <w:p>
+      <w:pPr>
+        <w:pStyle w:val="a0"/>
         <w:rPr>
           <w:rFonts w:ascii="Times New Roman" w:hAnsi="Times New Roman" w:cs="Times New Roman"/>
         </w:rPr>
@@ -17401,6 +17229,53 @@
       </w:r>
       <w:r>
         <w:t>。</w:t>
+      </w:r>
+    </w:p>
+    <w:p>
+      <w:pPr>
+        <w:jc w:val="center"/>
+      </w:pPr>
+      <w:r>
+        <w:drawing>
+          <wp:inline xmlns:a="http://schemas.openxmlformats.org/drawingml/2006/main" xmlns:pic="http://schemas.openxmlformats.org/drawingml/2006/picture">
+            <wp:extent cx="5616000" cy="2888229"/>
+            <wp:docPr id="2046731439" name="Picture 2046731439"/>
+            <wp:cNvGraphicFramePr>
+              <a:graphicFrameLocks noChangeAspect="1"/>
+            </wp:cNvGraphicFramePr>
+            <a:graphic>
+              <a:graphicData uri="http://schemas.openxmlformats.org/drawingml/2006/picture">
+                <pic:pic>
+                  <pic:nvPicPr>
+                    <pic:cNvPr id="0" name="fig_3_1_choice_head_pipeline.png"/>
+                    <pic:cNvPicPr/>
+                  </pic:nvPicPr>
+                  <pic:blipFill>
+                    <a:blip r:embed="rId22"/>
+                    <a:stretch>
+                      <a:fillRect/>
+                    </a:stretch>
+                  </pic:blipFill>
+                  <pic:spPr>
+                    <a:xfrm>
+                      <a:off x="0" y="0"/>
+                      <a:ext cx="5616000" cy="2888229"/>
+                    </a:xfrm>
+                    <a:prstGeom prst="rect"/>
+                  </pic:spPr>
+                </pic:pic>
+              </a:graphicData>
+            </a:graphic>
+          </wp:inline>
+        </w:drawing>
+      </w:r>
+    </w:p>
+    <w:p>
+      <w:pPr>
+        <w:jc w:val="center"/>
+      </w:pPr>
+      <w:r>
+        <w:t>图 3-1 Choice-Head 两阶段蒸馏流程图。</w:t>
       </w:r>
     </w:p>
     <w:p>
@@ -18473,17 +18348,11 @@
       <w:bookmarkStart w:id="56" w:name="stage-2gt-sft-精校"/>
       <w:bookmarkEnd w:id="54"/>
       <w:r>
-        <w:t>3.3.2 Stage 2</w:t>
-      </w:r>
-      <w:r>
-        <w:t>：</w:t>
-      </w:r>
-      <w:r>
-        <w:t xml:space="preserve">GT SFT </w:t>
-      </w:r>
-      <w:r>
-        <w:t>精校</w:t>
-      </w:r>
+        <w:t>Stage 2 通常训练 2–5 个 epoch。这里所说的教师“暗知识”，具体是指教师在 A/B/C/D/E 五个选项之间给出的非零概率分配、正确项与次优项之间的差距，以及对各干扰项的相对排序。Stage 2 的作用是在尽量保留这些选项级结构信息的同时，用 GT 标签把最终决策重新锚定到标准答案上，从而实现知识迁移与答案校准的平衡。</w:t>
+      </w:r>
+      <w:r/>
+      <w:r/>
+      <w:r/>
       <w:bookmarkEnd w:id="55"/>
     </w:p>
     <w:p>
@@ -18663,71 +18532,6 @@
           </m:r>
         </m:oMath>
       </m:oMathPara>
-    </w:p>
-    <w:p>
-      <w:pPr>
-        <w:pStyle w:val="a0"/>
-      </w:pPr>
-      <w:r>
-        <w:t xml:space="preserve">Stage 2 </w:t>
-      </w:r>
-      <w:r>
-        <w:t>通常训练</w:t>
-      </w:r>
-      <w:r>
-        <w:t xml:space="preserve"> 2–5 </w:t>
-      </w:r>
-      <w:proofErr w:type="gramStart"/>
-      <w:r>
-        <w:t>个</w:t>
-      </w:r>
-      <w:proofErr w:type="gramEnd"/>
-      <w:r>
-        <w:t xml:space="preserve"> epoch</w:t>
-      </w:r>
-      <w:r>
-        <w:t>。通过保留</w:t>
-      </w:r>
-      <w:r>
-        <w:t xml:space="preserve"> Stage 1 </w:t>
-      </w:r>
-      <w:r>
-        <w:t>学到的教师</w:t>
-      </w:r>
-      <w:r>
-        <w:t>“</w:t>
-      </w:r>
-      <w:r>
-        <w:t>暗知识</w:t>
-      </w:r>
-      <w:r>
-        <w:t>”</w:t>
-      </w:r>
-      <w:r>
-        <w:t>（选项间的相对难度信息），同时用</w:t>
-      </w:r>
-      <w:r>
-        <w:t xml:space="preserve"> GT </w:t>
-      </w:r>
-      <w:r>
-        <w:t>标签锚</w:t>
-      </w:r>
-      <w:proofErr w:type="gramStart"/>
-      <w:r>
-        <w:t>定正确</w:t>
-      </w:r>
-      <w:proofErr w:type="gramEnd"/>
-      <w:r>
-        <w:t>答案方向，实现知识迁移</w:t>
-      </w:r>
-      <w:proofErr w:type="gramStart"/>
-      <w:r>
-        <w:t>与答案</w:t>
-      </w:r>
-      <w:proofErr w:type="gramEnd"/>
-      <w:r>
-        <w:t>校准的平衡。</w:t>
-      </w:r>
     </w:p>
     <w:p>
       <w:pPr>

</xml_diff>